<commit_message>
docs(paper): add Fig 9 strain-by-combination membership matrix
List every predicted Top-10 combination and its member strains as a genus-colored
strain x combination matrix: the L. fermentum K7/K8/K11 trio is the 9/10 core
scaffold, with Bifidobacterium and a little Bacillus as complementary fills.
Embed it in results section 3.6 of the Word paper (now 9 figures).

Co-Authored-By: Claude Opus 4.8 <noreply@anthropic.com>
</commit_message>
<xml_diff>
--- a/docs/ProSlim_减脂菌株组合预测_论文_20260625.docx
+++ b/docs/ProSlim_减脂菌株组合预测_论文_20260625.docx
@@ -2171,22 +2171,6 @@
     </w:p>
     <w:p>
       <w:pPr>
-        <w:pStyle w:val="Heading2"/>
-        <w:spacing w:after="120" w:before="220"/>
-      </w:pPr>
-      <w:r>
-        <w:rPr>
-          <w:rFonts w:ascii="SimHei" w:cs="SimHei" w:eastAsia="SimHei" w:hAnsi="SimHei"/>
-          <w:b/>
-          <w:bCs/>
-          <w:sz w:val="25"/>
-          <w:szCs w:val="25"/>
-        </w:rPr>
-        <w:t xml:space="preserve">3.7  机制盲区</w:t>
-      </w:r>
-    </w:p>
-    <w:p>
-      <w:pPr>
         <w:spacing w:after="120" w:line="360"/>
         <w:ind w:firstLine="480"/>
         <w:jc w:val="both"/>
@@ -2197,7 +2181,7 @@
           <w:sz w:val="21"/>
           <w:szCs w:val="21"/>
         </w:rPr>
-        <w:t xml:space="preserve">按属级功能 guild 解析（图 7），全部 Top 组合仅覆盖 5 条机制轴中的 BSH（胆盐水解→降脂）与乳酸/乙酸两条，普遍缺失丁酸、丙酸与黏液屏障三条——因为高证据菌株几乎都是乳杆菌与双歧杆菌。这是证据驱动排序的固有偏向，提示应主动纳入丁酸/黏液轴候选作为机制对照臂。</w:t>
+        <w:t xml:space="preserve">为直观呈现全部预测组合的菌株构成，图 9 以菌株×组合成员矩阵列出 Top-10 组合：乳杆菌 K7/K8/K11 三联出现在 9/10 个组合中，构成核心骨架，双歧杆菌（IDCC4301、BBr60、B420 等）与少量芽孢杆菌作机制与生态位互补。</w:t>
       </w:r>
     </w:p>
     <w:p>
@@ -2208,9 +2192,9 @@
       <w:r>
         <w:drawing>
           <wp:inline distT="0" distB="0" distL="0" distR="0">
-            <wp:extent cx="5334000" cy="3562350"/>
+            <wp:extent cx="5334000" cy="2714625"/>
             <wp:effectExtent t="0" r="0" b="0" l="0"/>
-            <wp:docPr id="1" name="fig7_mechanism" descr="图 7  Top-10 组合的机制覆盖热图与盲区" title="图 7  Top-10 组合的机制覆盖热图与盲区"/>
+            <wp:docPr id="1" name="fig9_strain_membership" descr="图 9  预测的 Top-10 益生菌减脂组合及其菌株构成" title="图 9  预测的 Top-10 益生菌减脂组合及其菌株构成"/>
             <wp:cNvGraphicFramePr>
               <a:graphicFrameLocks xmlns:a="http://schemas.openxmlformats.org/drawingml/2006/main" noChangeAspect="1"/>
             </wp:cNvGraphicFramePr>
@@ -2233,6 +2217,99 @@
                   <pic:spPr bwMode="auto">
                     <a:xfrm>
                       <a:off x="0" y="0"/>
+                      <a:ext cx="5334000" cy="2714625"/>
+                    </a:xfrm>
+                    <a:prstGeom prst="rect">
+                      <a:avLst/>
+                    </a:prstGeom>
+                  </pic:spPr>
+                </pic:pic>
+              </a:graphicData>
+            </a:graphic>
+          </wp:inline>
+        </w:drawing>
+      </w:r>
+    </w:p>
+    <w:p>
+      <w:pPr>
+        <w:spacing w:after="200"/>
+        <w:jc w:val="center"/>
+      </w:pPr>
+      <w:r>
+        <w:rPr>
+          <w:rFonts w:ascii="SimHei" w:cs="SimHei" w:eastAsia="SimHei" w:hAnsi="SimHei"/>
+          <w:b/>
+          <w:bCs/>
+          <w:sz w:val="19"/>
+          <w:szCs w:val="19"/>
+        </w:rPr>
+        <w:t xml:space="preserve">图 9  预测的 Top-10 益生菌减脂组合及其菌株构成</w:t>
+      </w:r>
+    </w:p>
+    <w:p>
+      <w:pPr>
+        <w:pStyle w:val="Heading2"/>
+        <w:spacing w:after="120" w:before="220"/>
+      </w:pPr>
+      <w:r>
+        <w:rPr>
+          <w:rFonts w:ascii="SimHei" w:cs="SimHei" w:eastAsia="SimHei" w:hAnsi="SimHei"/>
+          <w:b/>
+          <w:bCs/>
+          <w:sz w:val="25"/>
+          <w:szCs w:val="25"/>
+        </w:rPr>
+        <w:t xml:space="preserve">3.7  机制盲区</w:t>
+      </w:r>
+    </w:p>
+    <w:p>
+      <w:pPr>
+        <w:spacing w:after="120" w:line="360"/>
+        <w:ind w:firstLine="480"/>
+        <w:jc w:val="both"/>
+      </w:pPr>
+      <w:r>
+        <w:rPr>
+          <w:rFonts w:ascii="SimSun" w:cs="SimSun" w:eastAsia="SimSun" w:hAnsi="SimSun"/>
+          <w:sz w:val="21"/>
+          <w:szCs w:val="21"/>
+        </w:rPr>
+        <w:t xml:space="preserve">按属级功能 guild 解析（图 7），全部 Top 组合仅覆盖 5 条机制轴中的 BSH（胆盐水解→降脂）与乳酸/乙酸两条，普遍缺失丁酸、丙酸与黏液屏障三条——因为高证据菌株几乎都是乳杆菌与双歧杆菌。这是证据驱动排序的固有偏向，提示应主动纳入丁酸/黏液轴候选作为机制对照臂。</w:t>
+      </w:r>
+    </w:p>
+    <w:p>
+      <w:pPr>
+        <w:spacing w:after="60" w:before="160"/>
+        <w:jc w:val="center"/>
+      </w:pPr>
+      <w:r>
+        <w:drawing>
+          <wp:inline distT="0" distB="0" distL="0" distR="0">
+            <wp:extent cx="5334000" cy="3562350"/>
+            <wp:effectExtent t="0" r="0" b="0" l="0"/>
+            <wp:docPr id="1" name="fig7_mechanism" descr="图 7  Top-10 组合的机制覆盖热图与盲区" title="图 7  Top-10 组合的机制覆盖热图与盲区"/>
+            <wp:cNvGraphicFramePr>
+              <a:graphicFrameLocks xmlns:a="http://schemas.openxmlformats.org/drawingml/2006/main" noChangeAspect="1"/>
+            </wp:cNvGraphicFramePr>
+            <a:graphic xmlns:a="http://schemas.openxmlformats.org/drawingml/2006/main">
+              <a:graphicData uri="http://schemas.openxmlformats.org/drawingml/2006/picture">
+                <pic:pic xmlns:pic="http://schemas.openxmlformats.org/drawingml/2006/picture">
+                  <pic:nvPicPr>
+                    <pic:cNvPr id="0" name="" descr=""/>
+                    <pic:cNvPicPr>
+                      <a:picLocks noChangeAspect="1" noChangeArrowheads="1"/>
+                    </pic:cNvPicPr>
+                  </pic:nvPicPr>
+                  <pic:blipFill>
+                    <a:blip r:embed="rId15" cstate="none"/>
+                    <a:srcRect/>
+                    <a:stretch>
+                      <a:fillRect/>
+                    </a:stretch>
+                  </pic:blipFill>
+                  <pic:spPr bwMode="auto">
+                    <a:xfrm>
+                      <a:off x="0" y="0"/>
                       <a:ext cx="5334000" cy="3562350"/>
                     </a:xfrm>
                     <a:prstGeom prst="rect">
@@ -2335,7 +2412,7 @@
                     </pic:cNvPicPr>
                   </pic:nvPicPr>
                   <pic:blipFill>
-                    <a:blip r:embed="rId15" cstate="none"/>
+                    <a:blip r:embed="rId16" cstate="none"/>
                     <a:srcRect/>
                     <a:stretch>
                       <a:fillRect/>

</xml_diff>